<commit_message>
fix: resolve Word XML corruption in dashboard template and refine CUBE_VIEW vs DASHBOARD classification
</commit_message>
<xml_diff>
--- a/templates/TC_DASHBOARD_TEMPLATE_TAGGED.docx
+++ b/templates/TC_DASHBOARD_TEMPLATE_TAGGED.docx
@@ -1,5 +1,731 @@
 
-<file path=word/document.xml>﻿<?xml version="1.0" encoding="utf-8" standalone="yes"?><w:document xmlns:wpc="http://schemas.microsoft.com/office/word/2010/wordprocessingCanvas" xmlns:cx="http://schemas.microsoft.com/office/drawing/2014/chartex" xmlns:cx1="http://schemas.microsoft.com/office/drawing/2015/9/8/chartex" xmlns:cx2="http://schemas.microsoft.com/office/drawing/2015/10/21/chartex" xmlns:cx3="http://schemas.microsoft.com/office/drawing/2016/5/9/chartex" xmlns:cx4="http://schemas.microsoft.com/office/drawing/2016/5/10/chartex" xmlns:cx5="http://schemas.microsoft.com/office/drawing/2016/5/11/chartex" xmlns:cx6="http://schemas.microsoft.com/office/drawing/2016/5/12/chartex" xmlns:cx7="http://schemas.microsoft.com/office/drawing/2016/5/13/chartex" xmlns:cx8="http://schemas.microsoft.com/office/drawing/2016/5/14/chartex" xmlns:mc="http://schemas.openxmlformats.org/markup-compatibility/2006" xmlns:aink="http://schemas.microsoft.com/office/drawing/2016/ink" xmlns:am3d="http://schemas.microsoft.com/office/drawing/2017/model3d" xmlns:o="urn:schemas-microsoft-com:office:office" xmlns:oel="http://schemas.microsoft.com/office/2019/extlst" xmlns:r="http://schemas.openxmlformats.org/officeDocument/2006/relationships" xmlns:m="http://schemas.openxmlformats.org/officeDocument/2006/math" xmlns:v="urn:schemas-microsoft-com:vml" xmlns:wp14="http://schemas.microsoft.com/office/word/2010/wordprocessingDrawing" xmlns:wp="http://schemas.openxmlformats.org/drawingml/2006/wordprocessingDrawing" xmlns:w10="urn:schemas-microsoft-com:office:word" xmlns:w="http://schemas.openxmlformats.org/wordprocessingml/2006/main" xmlns:w14="http://schemas.microsoft.com/office/word/2010/wordml" xmlns:w15="http://schemas.microsoft.com/office/word/2012/wordml" xmlns:w16cex="http://schemas.microsoft.com/office/word/2018/wordml/cex" xmlns:w16cid="http://schemas.microsoft.com/office/word/2016/wordml/cid" xmlns:w16="http://schemas.microsoft.com/office/word/2018/wordml" xmlns:w16du="http://schemas.microsoft.com/office/word/2023/wordml/word16du" xmlns:w16sdtdh="http://schemas.microsoft.com/office/word/2020/wordml/sdtdatahash" xmlns:w16sdtfl="http://schemas.microsoft.com/office/word/2024/wordml/sdtformatlock" xmlns:w16se="http://schemas.microsoft.com/office/word/2015/wordml/symex" xmlns:wpg="http://schemas.microsoft.com/office/word/2010/wordprocessingGroup" xmlns:wpi="http://schemas.microsoft.com/office/word/2010/wordprocessingInk" xmlns:wne="http://schemas.microsoft.com/office/word/2006/wordml" xmlns:wps="http://schemas.microsoft.com/office/word/2010/wordprocessingShape" mc:Ignorable="w14 w15 w16se w16cid w16 w16cex w16sdtdh w16sdtfl w16du wp14"><w:body><w:p><w:pPr><w:spacing w:before="240" w:after="240"/></w:pPr><w:r><w:rPr><w:b w:val="1"/></w:rPr><w:t xml:space="preserve">Status: </w:t></w:r><w:r><w:t>{status}</w:t></w:r></w:p><w:p><w:pPr><w:spacing w:before="240" w:after="240" /></w:pPr><w:r><w:rPr><w:rFonts w:ascii="Aptos" w:hAnsi="Aptos" w:eastAsia="Aptos" w:cs="Aptos" w:asciiTheme="minorAscii" w:hAnsiTheme="minorAscii" w:eastAsiaTheme="minorEastAsia" w:cstheme="minorBidi" /><w:b w:val="1" /><w:bCs w:val="1" /><w:color w:val="auto" /><w:sz w:val="24" /><w:szCs w:val="24" /><w:lang w:eastAsia="ja-JP" w:bidi="ar-SA" /></w:rPr><w:t>Testcase Summary:</w:t></w:r></w:p><w:tbl><w:tblPr><w:tblStyle w:val="TableGrid" /><w:bidiVisual w:val="0" /><w:tblW w:w="0" w:type="auto" /><w:tblBorders><w:top w:val="single" w:sz="6" /><w:left w:val="single" w:sz="6" /><w:bottom w:val="single" w:sz="6" /><w:right w:val="single" w:sz="6" /></w:tblBorders><w:tblLook w:val="04A0" w:firstRow="1" w:lastRow="0" w:firstColumn="1" w:lastColumn="0" w:noHBand="0" w:noVBand="1" /></w:tblPr><w:tblGrid><w:gridCol w:w="1215" /><w:gridCol w:w="2190" /><w:gridCol w:w="2910" /><w:gridCol w:w="2670" /></w:tblGrid><w:tr><w:trPr><w:trHeight w:val="285" /></w:trPr><w:tc><w:tcPr><w:tcW w:w="1215" w:type="dxa" /><w:tcBorders><w:top w:val="single" w:sz="6" /><w:left w:val="single" w:sz="6" /><w:bottom w:val="single" w:sz="6" /><w:right w:val="single" w:sz="6" /></w:tcBorders><w:tcMar><w:left w:w="90" w:type="dxa" /><w:right w:w="90" w:type="dxa" /></w:tcMar><w:vAlign w:val="top" /></w:tcPr><w:p><w:pPr><w:spacing w:after="160" w:line="278" w:lineRule="auto" /><w:jc w:val="center" /><w:rPr><w:rFonts w:ascii="Calibri" w:hAnsi="Calibri" w:eastAsia="Calibri" w:cs="Calibri" /><w:b w:val="0" /><w:bCs w:val="0" /><w:i w:val="0" /><w:iCs w:val="0" /><w:caps w:val="0" /><w:smallCaps w:val="0" /><w:color w:val="000000" w:themeColor="text1" w:themeTint="FF" w:themeShade="FF" /><w:sz w:val="24" /><w:szCs w:val="24" /></w:rPr></w:pPr><w:r><w:rPr><w:rFonts w:ascii="Calibri" w:hAnsi="Calibri" w:eastAsia="Calibri" w:cs="Calibri" /><w:b w:val="1" /><w:bCs w:val="1" /><w:i w:val="0" /><w:iCs w:val="0" /><w:caps w:val="0" /><w:smallCaps w:val="0" /><w:color w:val="000000" w:themeColor="text1" w:themeTint="FF" w:themeShade="FF" /><w:sz w:val="24" /><w:szCs w:val="24" /><w:lang w:val="en-US" /></w:rPr><w:t>S. No.</w:t></w:r></w:p></w:tc><w:tc><w:tcPr><w:tcW w:w="2190" w:type="dxa" /><w:tcBorders><w:top w:val="single" w:sz="6" /><w:left w:val="single" w:sz="6" /><w:bottom w:val="single" w:sz="6" /><w:right w:val="single" w:sz="6" /></w:tcBorders><w:tcMar><w:left w:w="90" w:type="dxa" /><w:right w:w="90" w:type="dxa" /></w:tcMar><w:vAlign w:val="top" /></w:tcPr><w:p><w:pPr><w:spacing w:before="0" w:beforeAutospacing="off" w:after="160" w:afterAutospacing="off" w:line="278" w:lineRule="auto" /><w:ind w:left="0" w:right="0" /><w:jc w:val="center" /><w:rPr><w:rFonts w:ascii="Calibri" w:hAnsi="Calibri" w:eastAsia="Calibri" w:cs="Calibri" /><w:b w:val="0" /><w:bCs w:val="0" /><w:i w:val="0" /><w:iCs w:val="0" /><w:caps w:val="0" /><w:smallCaps w:val="0" /><w:color w:val="000000" w:themeColor="text1" w:themeTint="FF" w:themeShade="FF" /><w:sz w:val="24" /><w:szCs w:val="24" /></w:rPr></w:pPr><w:r><w:rPr><w:rFonts w:ascii="Calibri" w:hAnsi="Calibri" w:eastAsia="Calibri" w:cs="Calibri" /><w:b w:val="1" /><w:bCs w:val="1" /><w:i w:val="0" /><w:iCs w:val="0" /><w:caps w:val="0" /><w:smallCaps w:val="0" /><w:color w:val="000000" w:themeColor="text1" w:themeTint="FF" w:themeShade="FF" /><w:sz w:val="24" /><w:szCs w:val="24" /><w:lang w:val="en-US" /></w:rPr><w:t xml:space="preserve">Total </w:t></w:r><w:r><w:rPr><w:rFonts w:ascii="Calibri" w:hAnsi="Calibri" w:eastAsia="Calibri" w:cs="Calibri" /><w:b w:val="1" /><w:bCs w:val="1" /><w:i w:val="0" /><w:iCs w:val="0" /><w:caps w:val="0" /><w:smallCaps w:val="0" /><w:color w:val="000000" w:themeColor="text1" w:themeTint="FF" w:themeShade="FF" /><w:sz w:val="24" /><w:szCs w:val="24" /><w:lang w:val="en-US" /></w:rPr><w:t>Dashboards</w:t></w:r></w:p></w:tc><w:tc><w:tcPr><w:tcW w:w="2910" w:type="dxa" /><w:tcBorders><w:top w:val="single" w:sz="6" /><w:left w:val="single" w:sz="6" /><w:bottom w:val="single" w:sz="6" /><w:right w:val="single" w:sz="6" /></w:tcBorders><w:tcMar><w:left w:w="90" w:type="dxa" /><w:right w:w="90" w:type="dxa" /></w:tcMar><w:vAlign w:val="top" /></w:tcPr><w:p><w:pPr><w:pStyle w:val="Normal" /><w:suppressLineNumbers w:val="0" /><w:bidi w:val="0" /><w:spacing w:before="0" w:beforeAutospacing="off" w:after="160" w:afterAutospacing="off" w:line="278" w:lineRule="auto" /><w:ind w:left="0" w:right="0" /><w:jc w:val="center" /></w:pPr><w:r><w:rPr><w:rFonts w:ascii="Calibri" w:hAnsi="Calibri" w:eastAsia="Calibri" w:cs="Calibri" /><w:b w:val="1" /><w:bCs w:val="1" /><w:i w:val="0" /><w:iCs w:val="0" /><w:caps w:val="0" /><w:smallCaps w:val="0" /><w:color w:val="000000" w:themeColor="text1" w:themeTint="FF" w:themeShade="FF" /><w:sz w:val="24" /><w:szCs w:val="24" /><w:lang w:val="en-US" /></w:rPr><w:t xml:space="preserve">Testcases per </w:t></w:r><w:r><w:rPr><w:rFonts w:ascii="Calibri" w:hAnsi="Calibri" w:eastAsia="Calibri" w:cs="Calibri" /><w:b w:val="1" /><w:bCs w:val="1" /><w:i w:val="0" /><w:iCs w:val="0" /><w:caps w:val="0" /><w:smallCaps w:val="0" /><w:color w:val="000000" w:themeColor="text1" w:themeTint="FF" w:themeShade="FF" /><w:sz w:val="24" /><w:szCs w:val="24" /><w:lang w:val="en-US" /></w:rPr><w:t>dashboard</w:t></w:r></w:p></w:tc><w:tc><w:tcPr><w:tcW w:w="2670" w:type="dxa" /><w:tcBorders><w:top w:val="single" w:sz="6" /><w:left w:val="single" w:sz="6" /><w:bottom w:val="single" w:sz="6" /><w:right w:val="single" w:sz="6" /></w:tcBorders><w:tcMar><w:left w:w="90" w:type="dxa" /><w:right w:w="90" w:type="dxa" /></w:tcMar><w:vAlign w:val="top" /></w:tcPr><w:p><w:pPr><w:spacing w:before="0" w:beforeAutospacing="off" w:after="160" w:afterAutospacing="off" w:line="278" w:lineRule="auto" /><w:ind w:left="0" w:right="0" /><w:jc w:val="center" /><w:rPr><w:rFonts w:ascii="Calibri" w:hAnsi="Calibri" w:eastAsia="Calibri" w:cs="Calibri" /><w:b w:val="0" /><w:bCs w:val="0" /><w:i w:val="0" /><w:iCs w:val="0" /><w:caps w:val="0" /><w:smallCaps w:val="0" /><w:color w:val="000000" w:themeColor="text1" w:themeTint="FF" w:themeShade="FF" /><w:sz w:val="24" /><w:szCs w:val="24" /></w:rPr></w:pPr><w:r><w:rPr><w:rFonts w:ascii="Calibri" w:hAnsi="Calibri" w:eastAsia="Calibri" w:cs="Calibri" /><w:b w:val="1" /><w:bCs w:val="1" /><w:i w:val="0" /><w:iCs w:val="0" /><w:caps w:val="0" /><w:smallCaps w:val="0" /><w:color w:val="000000" w:themeColor="text1" w:themeTint="FF" w:themeShade="FF" /><w:sz w:val="24" /><w:szCs w:val="24" /><w:lang w:val="en-US" /></w:rPr><w:t>Total Testcase</w:t></w:r></w:p></w:tc></w:tr><w:tr><w:trPr><w:trHeight w:val="285" /></w:trPr><w:tc><w:tcPr><w:tcW w:w="1215" w:type="dxa" /><w:tcBorders><w:top w:val="single" w:sz="6" /><w:left w:val="single" w:sz="6" /><w:bottom w:val="single" w:sz="6" /><w:right w:val="single" w:sz="6" /></w:tcBorders><w:tcMar><w:left w:w="90" w:type="dxa" /><w:right w:w="90" w:type="dxa" /></w:tcMar><w:vAlign w:val="top" /></w:tcPr><w:p><w:pPr><w:spacing w:after="160" w:line="278" w:lineRule="auto" /><w:jc w:val="center" /><w:rPr><w:rFonts w:ascii="Calibri" w:hAnsi="Calibri" w:eastAsia="Calibri" w:cs="Calibri" /><w:b w:val="0" /><w:bCs w:val="0" /><w:i w:val="0" /><w:iCs w:val="0" /><w:caps w:val="0" /><w:smallCaps w:val="0" /><w:color w:val="000000" w:themeColor="text1" w:themeTint="FF" w:themeShade="FF" /><w:sz w:val="24" /><w:szCs w:val="24" /></w:rPr></w:pPr><w:r><w:rPr><w:rFonts w:ascii="Calibri" w:hAnsi="Calibri" w:eastAsia="Calibri" w:cs="Calibri" /><w:b w:val="1" /><w:bCs w:val="1" /><w:i w:val="0" /><w:iCs w:val="0" /><w:caps w:val="0" /><w:smallCaps w:val="0" /><w:color w:val="000000" w:themeColor="text1" w:themeTint="FF" w:themeShade="FF" /><w:sz w:val="24" /><w:szCs w:val="24" /><w:lang w:val="en-US" /></w:rPr><w:t>1</w:t></w:r></w:p></w:tc><w:t>{total_reports}</w:t></w:r></w:p></w:tc><w:t>{tc_per_report}</w:t></w:r></w:p></w:tc><w:t>{total_testcase}</w:t></w:r></w:p></w:tc></w:tr></w:tbl><w:p><w:pPr><w:spacing w:before="240" w:after="240" /><w:rPr><w:rFonts w:ascii="Aptos" w:hAnsi="Aptos" w:eastAsia="Aptos" w:cs="Aptos" /><w:b w:val="1" /><w:bCs w:val="1" /></w:rPr></w:pPr><w:r><w:br /></w:r></w:p><w:tbl><w:tblPr><w:tblStyle w:val="TableGrid" /><w:tblW w:w="10254" w:type="dxa" /><w:tblBorders><w:top w:val="single" w:color="auto" w:sz="6" w:space="0" /><w:left w:val="single" w:color="auto" w:sz="6" w:space="0" /><w:bottom w:val="single" w:color="auto" w:sz="6" w:space="0" /><w:right w:val="single" w:color="auto" w:sz="6" w:space="0" /></w:tblBorders><w:tblLayout w:type="fixed" /><w:tblLook w:val="04A0" w:firstRow="1" w:lastRow="0" w:firstColumn="1" w:lastColumn="0" w:noHBand="0" w:noVBand="1" /></w:tblPr><w:tblGrid><w:gridCol w:w="928" /><w:gridCol w:w="6222" /><w:gridCol w:w="953" /><w:gridCol w:w="1043" /><w:gridCol w:w="1108" /></w:tblGrid><w:tr><w:trPr><w:cantSplit/></w:trPr><w:tc><w:tcPr><w:tcW w:w="9072" w:type="dxa"/><w:gridSpan w:val="5"/><w:tcBorders><w:top w:val="single" w:sz="6"/><w:left w:val="single" w:sz="6"/><w:bottom w:val="single" w:sz="6"/><w:right w:val="single" w:sz="6"/></w:tcBorders><w:shd w:val="clear" w:color="auto" w:fill="D9E2F3"/></w:tcPr><w:p><w:pPr><w:spacing w:before="120" w:after="120"/></w:pPr><w:r><w:rPr><w:b w:val="1"/><w:sz w:val="24"/></w:rPr><w:t>{#modules}{module_name}</w:t></w:r></w:p></w:tc></w:tr><w:tr><w:trPr><w:trHeight w:val="300" /></w:trPr><w:tc><w:tcPr><w:tcW w:w="928" w:type="dxa" /><w:tcBorders><w:top w:val="single" w:color="auto" w:sz="6" w:space="0" /><w:left w:val="single" w:color="auto" w:sz="6" w:space="0" /><w:bottom w:val="single" w:color="auto" w:sz="6" w:space="0" /><w:right w:val="single" w:color="auto" w:sz="6" w:space="0" /></w:tcBorders><w:tcMar><w:left w:w="105" w:type="dxa" /><w:right w:w="105" w:type="dxa" /></w:tcMar></w:tcPr><w:p><w:pPr><w:spacing w:after="160" w:line="278" w:lineRule="auto" /><w:jc w:val="center" /><w:rPr><w:rFonts w:ascii="Calibri" w:hAnsi="Calibri" w:eastAsia="Calibri" w:cs="Calibri" /></w:rPr></w:pPr><w:r><w:rPr><w:rFonts w:ascii="Calibri" w:hAnsi="Calibri" w:eastAsia="Calibri" w:cs="Calibri" /><w:b /><w:bCs /></w:rPr><w:t>S. No.</w:t></w:r></w:p></w:tc><w:tc><w:tcPr><w:tcW w:w="6222" w:type="dxa" /><w:tcBorders><w:top w:val="single" w:color="auto" w:sz="6" w:space="0" /><w:left w:val="single" w:color="auto" w:sz="6" w:space="0" /><w:bottom w:val="single" w:color="auto" w:sz="6" w:space="0" /><w:right w:val="single" w:color="auto" w:sz="6" w:space="0" /></w:tcBorders><w:tcMar><w:left w:w="105" w:type="dxa" /><w:right w:w="105" w:type="dxa" /></w:tcMar></w:tcPr><w:p><w:pPr><w:spacing w:after="160" w:line="278" w:lineRule="auto" /><w:jc w:val="center" /><w:rPr><w:rFonts w:ascii="Calibri" w:hAnsi="Calibri" w:eastAsia="Calibri" w:cs="Calibri" /></w:rPr></w:pPr><w:r><w:rPr><w:rFonts w:ascii="Calibri" w:hAnsi="Calibri" w:eastAsia="Calibri" w:cs="Calibri" /><w:b /><w:bCs /></w:rPr><w:t>Parameter</w:t></w:r></w:p></w:tc><w:tc><w:tcPr><w:tcW w:w="953" w:type="dxa" /><w:tcBorders><w:top w:val="single" w:color="auto" w:sz="6" w:space="0" /><w:left w:val="single" w:color="auto" w:sz="6" w:space="0" /><w:bottom w:val="single" w:color="auto" w:sz="6" w:space="0" /><w:right w:val="single" w:color="auto" w:sz="6" w:space="0" /></w:tcBorders><w:tcMar><w:left w:w="105" w:type="dxa" /><w:right w:w="105" w:type="dxa" /></w:tcMar></w:tcPr><w:p><w:pPr><w:spacing w:after="160" w:line="278" w:lineRule="auto" /><w:jc w:val="center" /><w:rPr><w:rFonts w:ascii="Calibri" w:hAnsi="Calibri" w:eastAsia="Calibri" w:cs="Calibri" /></w:rPr></w:pPr><w:r><w:rPr><w:rFonts w:ascii="Calibri" w:hAnsi="Calibri" w:eastAsia="Calibri" w:cs="Calibri" /><w:b /><w:bCs /></w:rPr><w:t>Yes</w:t></w:r></w:p></w:tc><w:tc><w:tcPr><w:tcW w:w="1043" w:type="dxa" /><w:tcBorders><w:top w:val="single" w:color="auto" w:sz="6" w:space="0" /><w:left w:val="single" w:color="auto" w:sz="6" w:space="0" /><w:bottom w:val="single" w:color="auto" w:sz="6" w:space="0" /><w:right w:val="single" w:color="auto" w:sz="6" w:space="0" /></w:tcBorders><w:tcMar><w:left w:w="105" w:type="dxa" /><w:right w:w="105" w:type="dxa" /></w:tcMar></w:tcPr><w:p><w:pPr><w:spacing w:after="160" w:line="278" w:lineRule="auto" /><w:jc w:val="center" /><w:rPr><w:rFonts w:ascii="Calibri" w:hAnsi="Calibri" w:eastAsia="Calibri" w:cs="Calibri" /></w:rPr></w:pPr><w:r><w:rPr><w:rFonts w:ascii="Calibri" w:hAnsi="Calibri" w:eastAsia="Calibri" w:cs="Calibri" /><w:b /><w:bCs /></w:rPr><w:t>No</w:t></w:r></w:p></w:tc><w:tc><w:tcPr><w:tcW w:w="1108" w:type="dxa" /><w:tcBorders><w:top w:val="single" w:color="auto" w:sz="6" w:space="0" /><w:left w:val="single" w:color="auto" w:sz="6" w:space="0" /><w:bottom w:val="single" w:color="auto" w:sz="6" w:space="0" /><w:right w:val="single" w:color="auto" w:sz="6" w:space="0" /></w:tcBorders><w:tcMar><w:left w:w="105" w:type="dxa" /><w:right w:w="105" w:type="dxa" /></w:tcMar></w:tcPr><w:p><w:pPr><w:spacing w:after="160" w:line="278" w:lineRule="auto" /><w:jc w:val="center" /><w:rPr><w:rFonts w:ascii="Calibri" w:hAnsi="Calibri" w:eastAsia="Calibri" w:cs="Calibri" /></w:rPr></w:pPr><w:r><w:rPr><w:rFonts w:ascii="Calibri" w:hAnsi="Calibri" w:eastAsia="Calibri" w:cs="Calibri" /><w:b /><w:bCs /></w:rPr><w:t>N/A</w:t></w:r></w:p></w:tc></w:tr><w:tr><w:trPr><w:trHeight w:val="300" /></w:trPr><w:tc><w:tcPr><w:tcW w:w="928" w:type="dxa" /><w:tcBorders><w:top w:val="single" w:color="auto" w:sz="6" w:space="0" /><w:left w:val="single" w:color="auto" w:sz="6" w:space="0" /><w:bottom w:val="single" w:color="auto" w:sz="6" w:space="0" /><w:right w:val="single" w:color="auto" w:sz="6" w:space="0" /></w:tcBorders><w:shd w:val="clear" w:color="auto" w:fill="FFFF00" /><w:tcMar><w:left w:w="105" w:type="dxa" /><w:right w:w="105" w:type="dxa" /></w:tcMar></w:tcPr><w:p><w:pPr><w:spacing w:line="278" w:lineRule="auto" /><w:jc w:val="center" /><w:rPr><w:rFonts w:ascii="Calibri" w:hAnsi="Calibri" w:eastAsia="Calibri" w:cs="Calibri" /><w:b /><w:bCs /></w:rPr></w:pPr><w:r><w:rPr><w:rFonts w:ascii="Calibri" w:hAnsi="Calibri" w:eastAsia="Calibri" w:cs="Calibri" /><w:b /><w:bCs /></w:rPr><w:t>A</w:t></w:r></w:p></w:tc><w:tc><w:tcPr><w:tcW w:w="6222" w:type="dxa" /><w:tcBorders><w:top w:val="single" w:color="auto" w:sz="6" w:space="0" /><w:left w:val="single" w:color="auto" w:sz="6" w:space="0" /><w:bottom w:val="single" w:color="auto" w:sz="6" w:space="0" /><w:right w:val="single" w:color="auto" w:sz="6" w:space="0" /></w:tcBorders><w:shd w:val="clear" w:color="auto" w:fill="FFFF00" /><w:tcMar><w:left w:w="105" w:type="dxa" /><w:right w:w="105" w:type="dxa" /></w:tcMar></w:tcPr><w:p><w:pPr><w:pStyle w:val="Normal" /><w:suppressLineNumbers w:val="0" /><w:bidi w:val="0" /><w:spacing w:before="0" w:beforeAutospacing="off" w:after="0" w:afterAutospacing="off" w:line="278" w:lineRule="auto" /><w:ind w:left="0" w:right="0" /><w:jc w:val="center" /></w:pPr><w:r><w:rPr><w:rFonts w:ascii="Calibri" w:hAnsi="Calibri" w:eastAsia="Calibri" w:cs="Calibri" /><w:b w:val="1" /><w:bCs w:val="1" /></w:rPr><w:t>{category_label}</w:t></w:r></w:p></w:tc><w:tc><w:tcPr><w:tcW w:w="953" w:type="dxa" /><w:tcBorders><w:top w:val="single" w:color="auto" w:sz="6" w:space="0" /><w:left w:val="single" w:color="auto" w:sz="6" w:space="0" /><w:bottom w:val="single" w:color="auto" w:sz="6" w:space="0" /><w:right w:val="single" w:color="auto" w:sz="6" w:space="0" /></w:tcBorders><w:shd w:val="clear" w:color="auto" w:fill="FFFF00" /><w:tcMar><w:left w:w="105" w:type="dxa" /><w:right w:w="105" w:type="dxa" /></w:tcMar></w:tcPr><w:p><w:pPr><w:spacing w:line="278" w:lineRule="auto" /><w:rPr><w:rFonts w:ascii="Calibri" w:hAnsi="Calibri" w:eastAsia="Calibri" w:cs="Calibri" /><w:b /><w:bCs /></w:rPr></w:pPr></w:p></w:tc><w:tc><w:tcPr><w:tcW w:w="1043" w:type="dxa" /><w:tcBorders><w:top w:val="single" w:color="auto" w:sz="6" w:space="0" /><w:left w:val="single" w:color="auto" w:sz="6" w:space="0" /><w:bottom w:val="single" w:color="auto" w:sz="6" w:space="0" /><w:right w:val="single" w:color="auto" w:sz="6" w:space="0" /></w:tcBorders><w:shd w:val="clear" w:color="auto" w:fill="FFFF00" /><w:tcMar><w:left w:w="105" w:type="dxa" /><w:right w:w="105" w:type="dxa" /></w:tcMar></w:tcPr><w:p><w:pPr><w:spacing w:line="278" w:lineRule="auto" /><w:rPr><w:rFonts w:ascii="Calibri" w:hAnsi="Calibri" w:eastAsia="Calibri" w:cs="Calibri" /><w:b /><w:bCs /></w:rPr></w:pPr></w:p></w:tc><w:tc><w:tcPr><w:tcW w:w="1108" w:type="dxa" /><w:tcBorders><w:top w:val="single" w:color="auto" w:sz="6" w:space="0" /><w:left w:val="single" w:color="auto" w:sz="6" w:space="0" /><w:bottom w:val="single" w:color="auto" w:sz="6" w:space="0" /><w:right w:val="single" w:color="auto" w:sz="6" w:space="0" /></w:tcBorders><w:shd w:val="clear" w:color="auto" w:fill="FFFF00" /><w:tcMar><w:left w:w="105" w:type="dxa" /><w:right w:w="105" w:type="dxa" /></w:tcMar></w:tcPr><w:p><w:pPr><w:spacing w:line="278" w:lineRule="auto" /><w:rPr><w:rFonts w:ascii="Calibri" w:hAnsi="Calibri" w:eastAsia="Calibri" w:cs="Calibri" /><w:b /><w:bCs /></w:rPr></w:pPr></w:p></w:tc></w:tr><w:tr><w:tc><w:tcPr><w:tcW w:w="9072" w:type="dxa"/><w:gridSpan w:val="5"/></w:tcPr><w:p><w:r><w:t>{#checklist}</w:t></w:r></w:p></w:tc></w:tr><w:tr><w:trPr><w:trHeight w:val="300" /></w:trPr><w:t>{sno}</w:t></w:r></w:p></w:tc><w:tc><w:tcPr><w:tcW w:w="6222" w:type="dxa" /><w:tcBorders><w:top w:val="single" w:color="auto" w:sz="6" w:space="0" /><w:left w:val="single" w:color="auto" w:sz="6" w:space="0" /><w:bottom w:val="single" w:color="auto" w:sz="6" w:space="0" /><w:right w:val="single" w:color="auto" w:sz="6" w:space="0" /></w:tcBorders><w:tcMar><w:left w:w="105" w:type="dxa" /><w:right w:w="105" w:type="dxa" /></w:tcMar></w:tcPr><w:p><w:pPr><w:jc w:val="left"/></w:pPr><w:r><w:t>{parameter}</w:t></w:r></w:p></w:tc><w:t>{yes_mark}</w:t></w:r></w:p></w:tc><w:t>{no_mark}</w:t></w:r></w:p></w:tc><w:t>{na_mark}</w:t></w:r></w:p></w:tc></w:tr><w:tr><w:tc><w:tcPr><w:tcW w:w="9072" w:type="dxa"/><w:gridSpan w:val="5"/></w:tcPr><w:p><w:r><w:t>{/checklist}</w:t></w:r></w:p></w:tc></w:tr><w:tr><w:tc><w:tcPr><w:tcW w:w="9072" w:type="dxa"/><w:gridSpan w:val="5"/></w:tcPr><w:p><w:r><w:t>{/modules}</w:t></w:r></w:p></w:tc></w:tr></w:tbl><w:p><w:pPr><w:pStyle w:val="Normal" /><w:rPr><w:rFonts w:ascii="Aptos" w:hAnsi="Aptos" w:eastAsia="Aptos" w:cs="Aptos" /><w:noProof w:val="0" /><w:sz w:val="24" /><w:szCs w:val="24" /><w:lang w:val="en-US" /></w:rPr></w:pPr><w:r><w:br /></w:r><w:r><w:rPr><w:sz w:val="22" /><w:szCs w:val="22" /></w:rPr><w:t xml:space="preserve">Please find </w:t></w:r><w:r><w:rPr><w:sz w:val="22" /><w:szCs w:val="22" /></w:rPr><w:t>th</w:t></w:r><w:r><w:rPr><w:sz w:val="22" /><w:szCs w:val="22" /></w:rPr><w:t>e</w:t></w:r><w:r><w:rPr><w:sz w:val="22" /><w:szCs w:val="22" /></w:rPr><w:t xml:space="preserve"> attached </w:t></w:r><w:r><w:rPr><w:sz w:val="22" /><w:szCs w:val="22" /></w:rPr><w:t>link for the changes made</w:t></w:r><w:r><w:rPr><w:sz w:val="22" /><w:szCs w:val="22" /></w:rPr><w:t>:</w:t></w:r><w:r><w:br /></w:r><w:hyperlink r:id="Rcbb83a288ae841ff"><w:r><w:rPr><w:rStyle w:val="Hyperlink" /><w:noProof w:val="0" /><w:sz w:val="22" /><w:szCs w:val="22" /><w:lang w:val="en-US" /></w:rPr><w:t>{remediation_file_name}</w:t></w:r></w:hyperlink></w:p><w:p><w:pPr><w:rPr><w:rFonts w:ascii="Calibri" w:hAnsi="Calibri" w:eastAsia="Calibri" w:cs="Calibri" /><w:color w:val="000000" w:themeColor="text1" /></w:rPr></w:pPr></w:p><w:p /><w:p /><w:p /><w:sectPr><w:pgSz w:w="12240" w:h="15840" w:orient="portrait" /><w:pgMar w:top="1440" w:right="1440" w:bottom="1440" w:left="1440" w:header="720" w:footer="720" w:gutter="0" /><w:cols w:space="720" /><w:docGrid w:linePitch="360" /></w:sectPr></w:body></w:document>
+<file path=word/document.xml><?xml version="1.0" encoding="utf-8"?>
+<w:document xmlns:wpc="http://schemas.microsoft.com/office/word/2010/wordprocessingCanvas" xmlns:cx="http://schemas.microsoft.com/office/drawing/2014/chartex" xmlns:cx1="http://schemas.microsoft.com/office/drawing/2015/9/8/chartex" xmlns:cx2="http://schemas.microsoft.com/office/drawing/2015/10/21/chartex" xmlns:cx3="http://schemas.microsoft.com/office/drawing/2016/5/9/chartex" xmlns:cx4="http://schemas.microsoft.com/office/drawing/2016/5/10/chartex" xmlns:cx5="http://schemas.microsoft.com/office/drawing/2016/5/11/chartex" xmlns:cx6="http://schemas.microsoft.com/office/drawing/2016/5/12/chartex" xmlns:cx7="http://schemas.microsoft.com/office/drawing/2016/5/13/chartex" xmlns:cx8="http://schemas.microsoft.com/office/drawing/2016/5/14/chartex" xmlns:mc="http://schemas.openxmlformats.org/markup-compatibility/2006" xmlns:aink="http://schemas.microsoft.com/office/drawing/2016/ink" xmlns:am3d="http://schemas.microsoft.com/office/drawing/2017/model3d" xmlns:o="urn:schemas-microsoft-com:office:office" xmlns:oel="http://schemas.microsoft.com/office/2019/extlst" xmlns:r="http://schemas.openxmlformats.org/officeDocument/2006/relationships" xmlns:m="http://schemas.openxmlformats.org/officeDocument/2006/math" xmlns:v="urn:schemas-microsoft-com:vml" xmlns:wp14="http://schemas.microsoft.com/office/word/2010/wordprocessingDrawing" xmlns:wp="http://schemas.openxmlformats.org/drawingml/2006/wordprocessingDrawing" xmlns:w10="urn:schemas-microsoft-com:office:word" xmlns:w="http://schemas.openxmlformats.org/wordprocessingml/2006/main" xmlns:w14="http://schemas.microsoft.com/office/word/2010/wordml" xmlns:w15="http://schemas.microsoft.com/office/word/2012/wordml" xmlns:w16cex="http://schemas.microsoft.com/office/word/2018/wordml/cex" xmlns:w16cid="http://schemas.microsoft.com/office/word/2016/wordml/cid" xmlns:w16="http://schemas.microsoft.com/office/word/2018/wordml" xmlns:w16du="http://schemas.microsoft.com/office/word/2023/wordml/word16du" xmlns:w16sdtdh="http://schemas.microsoft.com/office/word/2020/wordml/sdtdatahash" xmlns:w16sdtfl="http://schemas.microsoft.com/office/word/2024/wordml/sdtformatlock" xmlns:w16se="http://schemas.microsoft.com/office/word/2015/wordml/symex" xmlns:wpg="http://schemas.microsoft.com/office/word/2010/wordprocessingGroup" xmlns:wpi="http://schemas.microsoft.com/office/word/2010/wordprocessingInk" xmlns:wne="http://schemas.microsoft.com/office/word/2006/wordml" xmlns:wps="http://schemas.microsoft.com/office/word/2010/wordprocessingShape" mc:Ignorable="w14 w15 w16se w16cid w16 w16cex w16sdtdh w16sdtfl w16du wp14">
+  <w:body>
+    <w:p>
+      <w:pPr>
+        <w:jc w:val="center"/>
+      </w:pPr>
+      <w:r>
+        <w:rPr>
+          <w:rFonts w:ascii="Calibri" w:hAnsi="Calibri" w:cs="Calibri"/>
+          <w:b w:val="1"/>
+          <w:sz w:val="36"/>
+          <w:u w:val="single"/>
+        </w:rPr>
+        <w:t>{doc_title}</w:t>
+      </w:r>
+    </w:p>
+    <w:p>
+      <w:pPr>
+        <w:spacing w:before="240" w:after="240"/>
+        <w:rPr>
+          <w:rFonts w:ascii="Aptos" w:hAnsi="Aptos" w:eastAsia="Aptos" w:cs="Aptos"/>
+        </w:rPr>
+      </w:pPr>
+      <w:r>
+        <w:rPr>
+          <w:rFonts w:ascii="Aptos" w:hAnsi="Aptos" w:eastAsia="Aptos" w:cs="Aptos"/>
+          <w:b/>
+          <w:bCs/>
+        </w:rPr>
+        <w:t xml:space="preserve">Project Name: </w:t>
+      </w:r>
+      <w:r>
+        <w:t>{project_name}</w:t>
+      </w:r>
+    </w:p>
+    <w:p>
+      <w:pPr>
+        <w:spacing w:before="240" w:after="240"/>
+      </w:pPr>
+      <w:r>
+        <w:rPr>
+          <w:b w:val="1"/>
+        </w:rPr>
+        <w:t xml:space="preserve">Review Date: </w:t>
+      </w:r>
+      <w:r>
+        <w:t>{review_date}</w:t>
+      </w:r>
+    </w:p>
+    <w:p>
+      <w:pPr>
+        <w:spacing w:before="240" w:after="240"/>
+      </w:pPr>
+      <w:r>
+        <w:rPr>
+          <w:b w:val="1"/>
+        </w:rPr>
+        <w:t xml:space="preserve">Status: </w:t>
+      </w:r>
+      <w:r>
+        <w:t>{status}</w:t>
+      </w:r>
+    </w:p>
+    <w:p>
+      <w:pPr>
+        <w:spacing w:before="240" w:after="240"/>
+      </w:pPr>
+      <w:r>
+        <w:rPr>
+          <w:rFonts w:ascii="Aptos" w:hAnsi="Aptos" w:eastAsia="Aptos" w:cs="Aptos" w:asciiTheme="minorAscii" w:hAnsiTheme="minorAscii" w:eastAsiaTheme="minorEastAsia" w:cstheme="minorBidi"/>
+          <w:b w:val="1"/>
+          <w:bCs w:val="1"/>
+          <w:color w:val="auto"/>
+          <w:sz w:val="24"/>
+          <w:szCs w:val="24"/>
+          <w:lang w:eastAsia="ja-JP" w:bidi="ar-SA"/>
+        </w:rPr>
+        <w:t>Testcase Summary:</w:t>
+      </w:r>
+    </w:p>
+    <w:tbl>
+      <w:tblPr>
+        <w:tblStyle w:val="TableGrid"/>
+        <w:tblW w:type="auto" w:w="0"/>
+        <w:tblLayout w:type="fixed"/>
+        <w:tblLook w:firstColumn="1" w:firstRow="1" w:lastColumn="0" w:lastRow="0" w:noHBand="0" w:noVBand="1" w:val="04A0"/>
+      </w:tblPr>
+      <w:tblGrid>
+        <w:gridCol w:w="864"/>
+        <w:gridCol w:w="2304"/>
+        <w:gridCol w:w="2592"/>
+        <w:gridCol w:w="2304"/>
+      </w:tblGrid>
+      <w:tr>
+        <w:tc>
+          <w:tcPr>
+            <w:tcW w:type="dxa" w:w="864"/>
+          </w:tcPr>
+          <w:p>
+            <w:r>
+              <w:rPr>
+                <w:b/>
+              </w:rPr>
+              <w:t>S. No.</w:t>
+            </w:r>
+          </w:p>
+        </w:tc>
+        <w:tc>
+          <w:tcPr>
+            <w:tcW w:type="dxa" w:w="2304"/>
+          </w:tcPr>
+          <w:p>
+            <w:r>
+              <w:rPr>
+                <w:b/>
+              </w:rPr>
+              <w:t>{total_label}</w:t>
+            </w:r>
+          </w:p>
+        </w:tc>
+        <w:tc>
+          <w:tcPr>
+            <w:tcW w:type="dxa" w:w="2592"/>
+          </w:tcPr>
+          <w:p>
+            <w:r>
+              <w:rPr>
+                <w:b/>
+              </w:rPr>
+              <w:t>{tc_per_label}</w:t>
+            </w:r>
+          </w:p>
+        </w:tc>
+        <w:tc>
+          <w:tcPr>
+            <w:tcW w:type="dxa" w:w="2304"/>
+          </w:tcPr>
+          <w:p>
+            <w:r>
+              <w:rPr>
+                <w:b/>
+              </w:rPr>
+              <w:t>Total Testcase</w:t>
+            </w:r>
+          </w:p>
+        </w:tc>
+      </w:tr>
+      <w:tr>
+        <w:tc>
+          <w:tcPr>
+            <w:tcW w:type="dxa" w:w="864"/>
+          </w:tcPr>
+          <w:p>
+            <w:r>
+              <w:t>1</w:t>
+            </w:r>
+          </w:p>
+        </w:tc>
+        <w:tc>
+          <w:tcPr>
+            <w:tcW w:type="dxa" w:w="2304"/>
+          </w:tcPr>
+          <w:p>
+            <w:r>
+              <w:t>{total_reports}</w:t>
+            </w:r>
+          </w:p>
+        </w:tc>
+        <w:tc>
+          <w:tcPr>
+            <w:tcW w:type="dxa" w:w="2592"/>
+          </w:tcPr>
+          <w:p>
+            <w:r>
+              <w:t>{tc_per_report}</w:t>
+            </w:r>
+          </w:p>
+        </w:tc>
+        <w:tc>
+          <w:tcPr>
+            <w:tcW w:type="dxa" w:w="2304"/>
+          </w:tcPr>
+          <w:p>
+            <w:r>
+              <w:t>{total_testcase}</w:t>
+            </w:r>
+          </w:p>
+        </w:tc>
+      </w:tr>
+    </w:tbl>
+    <w:p>
+      <w:pPr>
+        <w:spacing w:before="240" w:after="240"/>
+        <w:rPr>
+          <w:rFonts w:ascii="Aptos" w:hAnsi="Aptos" w:eastAsia="Aptos" w:cs="Aptos"/>
+          <w:b w:val="1"/>
+          <w:bCs w:val="1"/>
+        </w:rPr>
+      </w:pPr>
+      <w:r>
+        <w:br/>
+      </w:r>
+    </w:p>
+    <w:p>
+      <w:r>
+        <w:t>{#modules}</w:t>
+      </w:r>
+    </w:p>
+    <w:tbl>
+      <w:tblPr>
+        <w:tblStyle w:val="TableGrid"/>
+        <w:tblW w:w="10254" w:type="dxa"/>
+        <w:tblBorders>
+          <w:top w:val="single" w:color="auto" w:sz="6" w:space="0"/>
+          <w:left w:val="single" w:color="auto" w:sz="6" w:space="0"/>
+          <w:bottom w:val="single" w:color="auto" w:sz="6" w:space="0"/>
+          <w:right w:val="single" w:color="auto" w:sz="6" w:space="0"/>
+        </w:tblBorders>
+        <w:tblLayout w:type="fixed"/>
+        <w:tblLook w:val="04A0" w:firstRow="1" w:lastRow="0" w:firstColumn="1" w:lastColumn="0" w:noHBand="0" w:noVBand="1"/>
+      </w:tblPr>
+      <w:tblGrid>
+        <w:gridCol w:w="928"/>
+        <w:gridCol w:w="6222"/>
+        <w:gridCol w:w="953"/>
+        <w:gridCol w:w="1043"/>
+        <w:gridCol w:w="1108"/>
+      </w:tblGrid>
+      <w:tr>
+        <w:trPr>
+          <w:cantSplit/>
+        </w:trPr>
+        <w:tc>
+          <w:tcPr>
+            <w:tcW w:w="9072" w:type="dxa"/>
+            <w:gridSpan w:val="5"/>
+            <w:tcBorders>
+              <w:top w:val="single" w:sz="6"/>
+              <w:left w:val="single" w:sz="6"/>
+              <w:bottom w:val="single" w:sz="6"/>
+              <w:right w:val="single" w:sz="6"/>
+            </w:tcBorders>
+            <w:shd w:val="clear" w:color="auto" w:fill="D9E2F3"/>
+          </w:tcPr>
+          <w:p>
+            <w:pPr>
+              <w:spacing w:before="120" w:after="120"/>
+            </w:pPr>
+            <w:r>
+              <w:rPr>
+                <w:b w:val="1"/>
+                <w:sz w:val="24"/>
+              </w:rPr>
+              <w:t>{module_name}</w:t>
+            </w:r>
+          </w:p>
+        </w:tc>
+      </w:tr>
+      <w:tr>
+        <w:trPr>
+          <w:trHeight w:val="300"/>
+        </w:trPr>
+        <w:tc>
+          <w:tcPr>
+            <w:tcW w:w="928" w:type="dxa"/>
+            <w:tcBorders>
+              <w:top w:val="single" w:color="auto" w:sz="6" w:space="0"/>
+              <w:left w:val="single" w:color="auto" w:sz="6" w:space="0"/>
+              <w:bottom w:val="single" w:color="auto" w:sz="6" w:space="0"/>
+              <w:right w:val="single" w:color="auto" w:sz="6" w:space="0"/>
+            </w:tcBorders>
+            <w:tcMar>
+              <w:left w:w="105" w:type="dxa"/>
+              <w:right w:w="105" w:type="dxa"/>
+            </w:tcMar>
+          </w:tcPr>
+          <w:p>
+            <w:pPr>
+              <w:jc w:val="center"/>
+            </w:pPr>
+            <w:r>
+              <w:rPr>
+                <w:b/>
+              </w:rPr>
+              <w:t>S. No.</w:t>
+            </w:r>
+          </w:p>
+        </w:tc>
+        <w:tc>
+          <w:tcPr>
+            <w:tcW w:w="6222" w:type="dxa"/>
+            <w:tcBorders>
+              <w:top w:val="single" w:color="auto" w:sz="6" w:space="0"/>
+              <w:left w:val="single" w:color="auto" w:sz="6" w:space="0"/>
+              <w:bottom w:val="single" w:color="auto" w:sz="6" w:space="0"/>
+              <w:right w:val="single" w:color="auto" w:sz="6" w:space="0"/>
+            </w:tcBorders>
+            <w:tcMar>
+              <w:left w:w="105" w:type="dxa"/>
+              <w:right w:w="105" w:type="dxa"/>
+            </w:tcMar>
+          </w:tcPr>
+          <w:p>
+            <w:pPr>
+              <w:jc w:val="center"/>
+            </w:pPr>
+            <w:r>
+              <w:rPr>
+                <w:b/>
+              </w:rPr>
+              <w:t>Checklist Item</w:t>
+            </w:r>
+          </w:p>
+        </w:tc>
+        <w:tc>
+          <w:tcPr>
+            <w:tcW w:w="953" w:type="dxa"/>
+            <w:tcBorders>
+              <w:top w:val="single" w:color="auto" w:sz="6" w:space="0"/>
+              <w:left w:val="single" w:color="auto" w:sz="6" w:space="0"/>
+              <w:bottom w:val="single" w:color="auto" w:sz="6" w:space="0"/>
+              <w:right w:val="single" w:color="auto" w:sz="6" w:space="0"/>
+            </w:tcBorders>
+            <w:tcMar>
+              <w:left w:w="105" w:type="dxa"/>
+              <w:right w:w="105" w:type="dxa"/>
+            </w:tcMar>
+          </w:tcPr>
+          <w:p>
+            <w:pPr>
+              <w:jc w:val="center"/>
+            </w:pPr>
+            <w:r>
+              <w:rPr>
+                <w:b/>
+              </w:rPr>
+              <w:t>Yes</w:t>
+            </w:r>
+          </w:p>
+        </w:tc>
+        <w:tc>
+          <w:tcPr>
+            <w:tcW w:w="1043" w:type="dxa"/>
+            <w:tcBorders>
+              <w:top w:val="single" w:color="auto" w:sz="6" w:space="0"/>
+              <w:left w:val="single" w:color="auto" w:sz="6" w:space="0"/>
+              <w:bottom w:val="single" w:color="auto" w:sz="6" w:space="0"/>
+              <w:right w:val="single" w:color="auto" w:sz="6" w:space="0"/>
+            </w:tcBorders>
+            <w:tcMar>
+              <w:left w:w="105" w:type="dxa"/>
+              <w:right w:w="105" w:type="dxa"/>
+            </w:tcMar>
+          </w:tcPr>
+          <w:p>
+            <w:pPr>
+              <w:jc w:val="center"/>
+            </w:pPr>
+            <w:r>
+              <w:rPr>
+                <w:b/>
+              </w:rPr>
+              <w:t>No</w:t>
+            </w:r>
+          </w:p>
+        </w:tc>
+        <w:tc>
+          <w:tcPr>
+            <w:tcW w:w="1108" w:type="dxa"/>
+            <w:tcBorders>
+              <w:top w:val="single" w:color="auto" w:sz="6" w:space="0"/>
+              <w:left w:val="single" w:color="auto" w:sz="6" w:space="0"/>
+              <w:bottom w:val="single" w:color="auto" w:sz="6" w:space="0"/>
+              <w:right w:val="single" w:color="auto" w:sz="6" w:space="0"/>
+            </w:tcBorders>
+            <w:tcMar>
+              <w:left w:w="105" w:type="dxa"/>
+              <w:right w:w="105" w:type="dxa"/>
+            </w:tcMar>
+          </w:tcPr>
+          <w:p>
+            <w:pPr>
+              <w:jc w:val="center"/>
+            </w:pPr>
+            <w:r>
+              <w:rPr>
+                <w:b/>
+              </w:rPr>
+              <w:t>N/A</w:t>
+            </w:r>
+          </w:p>
+        </w:tc>
+      </w:tr>
+      <w:tr>
+        <w:trPr>
+          <w:trHeight w:val="300"/>
+        </w:trPr>
+        <w:tc>
+          <w:tcPr>
+            <w:tcW w:w="928" w:type="dxa"/>
+            <w:tcBorders>
+              <w:top w:val="single" w:color="auto" w:sz="6" w:space="0"/>
+              <w:left w:val="single" w:color="auto" w:sz="6" w:space="0"/>
+              <w:bottom w:val="single" w:color="auto" w:sz="6" w:space="0"/>
+              <w:right w:val="single" w:color="auto" w:sz="6" w:space="0"/>
+            </w:tcBorders>
+            <w:shd w:val="clear" w:color="auto" w:fill="FFFF00"/>
+            <w:tcMar>
+              <w:left w:w="105" w:type="dxa"/>
+              <w:right w:w="105" w:type="dxa"/>
+            </w:tcMar>
+          </w:tcPr>
+          <w:p>
+            <w:pPr>
+              <w:jc w:val="center"/>
+            </w:pPr>
+            <w:r>
+              <w:rPr>
+                <w:b/>
+              </w:rPr>
+              <w:t>A</w:t>
+            </w:r>
+          </w:p>
+        </w:tc>
+        <w:tc>
+          <w:tcPr>
+            <w:tcW w:w="6222" w:type="dxa"/>
+            <w:tcBorders>
+              <w:top w:val="single" w:color="auto" w:sz="6" w:space="0"/>
+              <w:left w:val="single" w:color="auto" w:sz="6" w:space="0"/>
+              <w:bottom w:val="single" w:color="auto" w:sz="6" w:space="0"/>
+              <w:right w:val="single" w:color="auto" w:sz="6" w:space="0"/>
+            </w:tcBorders>
+            <w:shd w:val="clear" w:color="auto" w:fill="FFFF00"/>
+            <w:tcMar>
+              <w:left w:w="105" w:type="dxa"/>
+              <w:right w:w="105" w:type="dxa"/>
+            </w:tcMar>
+          </w:tcPr>
+          <w:p>
+            <w:pPr>
+              <w:jc w:val="center"/>
+            </w:pPr>
+            <w:r>
+              <w:rPr>
+                <w:b w:val="1"/>
+                <w:bCs w:val="1"/>
+              </w:rPr>
+              <w:t xml:space="preserve"> {category_label} </w:t>
+            </w:r>
+          </w:p>
+        </w:tc>
+        <w:tc>
+          <w:tcPr>
+            <w:tcW w:w="953" w:type="dxa"/>
+            <w:tcBorders>
+              <w:top w:val="single" w:color="auto" w:sz="6" w:space="0"/>
+              <w:left w:val="single" w:color="auto" w:sz="6" w:space="0"/>
+              <w:bottom w:val="single" w:color="auto" w:sz="6" w:space="0"/>
+              <w:right w:val="single" w:color="auto" w:sz="6" w:space="0"/>
+            </w:tcBorders>
+            <w:shd w:val="clear" w:color="auto" w:fill="FFFF00"/>
+            <w:tcMar>
+              <w:left w:w="105" w:type="dxa"/>
+              <w:right w:w="105" w:type="dxa"/>
+            </w:tcMar>
+          </w:tcPr>
+          <w:p/>
+        </w:tc>
+        <w:tc>
+          <w:tcPr>
+            <w:tcW w:w="1043" w:type="dxa"/>
+            <w:tcBorders>
+              <w:top w:val="single" w:color="auto" w:sz="6" w:space="0"/>
+              <w:left w:val="single" w:color="auto" w:sz="6" w:space="0"/>
+              <w:bottom w:val="single" w:color="auto" w:sz="6" w:space="0"/>
+              <w:right w:val="single" w:color="auto" w:sz="6" w:space="0"/>
+            </w:tcBorders>
+            <w:shd w:val="clear" w:color="auto" w:fill="FFFF00"/>
+            <w:tcMar>
+              <w:left w:w="105" w:type="dxa"/>
+              <w:right w:w="105" w:type="dxa"/>
+            </w:tcMar>
+          </w:tcPr>
+          <w:p/>
+        </w:tc>
+        <w:tc>
+          <w:tcPr>
+            <w:tcW w:w="1108" w:type="dxa"/>
+            <w:tcBorders>
+              <w:top w:val="single" w:color="auto" w:sz="6" w:space="0"/>
+              <w:left w:val="single" w:color="auto" w:sz="6" w:space="0"/>
+              <w:bottom w:val="single" w:color="auto" w:sz="6" w:space="0"/>
+              <w:right w:val="single" w:color="auto" w:sz="6" w:space="0"/>
+            </w:tcBorders>
+            <w:shd w:val="clear" w:color="auto" w:fill="FFFF00"/>
+            <w:tcMar>
+              <w:left w:w="105" w:type="dxa"/>
+              <w:right w:w="105" w:type="dxa"/>
+            </w:tcMar>
+          </w:tcPr>
+          <w:p/>
+        </w:tc>
+      </w:tr>
+      <w:tr>
+        <w:trPr>
+          <w:trHeight w:val="300"/>
+        </w:trPr>
+        <w:tc>
+          <w:tcPr>
+            <w:tcW w:w="928" w:type="dxa"/>
+            <w:tcBorders>
+              <w:top w:val="single" w:color="auto" w:sz="6" w:space="0"/>
+              <w:left w:val="single" w:color="auto" w:sz="6" w:space="0"/>
+              <w:bottom w:val="single" w:color="auto" w:sz="6" w:space="0"/>
+              <w:right w:val="single" w:color="auto" w:sz="6" w:space="0"/>
+            </w:tcBorders>
+            <w:tcMar>
+              <w:left w:w="105" w:type="dxa"/>
+              <w:right w:w="105" w:type="dxa"/>
+            </w:tcMar>
+          </w:tcPr>
+          <w:p>
+            <w:pPr>
+              <w:jc w:val="center"/>
+            </w:pPr>
+            <w:r>
+              <w:t>{#checklist}{sno}</w:t>
+            </w:r>
+          </w:p>
+        </w:tc>
+        <w:tc>
+          <w:tcPr>
+            <w:tcW w:w="6222" w:type="dxa"/>
+            <w:tcBorders>
+              <w:top w:val="single" w:color="auto" w:sz="6" w:space="0"/>
+              <w:left w:val="single" w:color="auto" w:sz="6" w:space="0"/>
+              <w:bottom w:val="single" w:color="auto" w:sz="6" w:space="0"/>
+              <w:right w:val="single" w:color="auto" w:sz="6" w:space="0"/>
+            </w:tcBorders>
+            <w:tcMar>
+              <w:left w:w="105" w:type="dxa"/>
+              <w:right w:w="105" w:type="dxa"/>
+            </w:tcMar>
+          </w:tcPr>
+          <w:p>
+            <w:pPr>
+              <w:jc w:val="left"/>
+            </w:pPr>
+            <w:r>
+              <w:rPr>
+                <w:rFonts w:ascii="Aptos Narrow" w:hAnsi="Aptos Narrow" w:cs="Calibri"/>
+                <w:sz w:val="22"/>
+                <w:szCs w:val="22"/>
+              </w:rPr>
+              <w:t xml:space="preserve">{parameter}</w:t>
+            </w:r>
+          </w:p>
+        </w:tc>
+        <w:tc>
+          <w:tcPr>
+            <w:tcW w:w="953" w:type="dxa"/>
+            <w:tcBorders>
+              <w:top w:val="single" w:color="auto" w:sz="6" w:space="0"/>
+              <w:left w:val="single" w:color="auto" w:sz="6" w:space="0"/>
+              <w:bottom w:val="single" w:color="auto" w:sz="6" w:space="0"/>
+              <w:right w:val="single" w:color="auto" w:sz="6" w:space="0"/>
+            </w:tcBorders>
+            <w:tcMar>
+              <w:left w:w="105" w:type="dxa"/>
+              <w:right w:w="105" w:type="dxa"/>
+            </w:tcMar>
+          </w:tcPr>
+          <w:p>
+            <w:pPr>
+              <w:jc w:val="center"/>
+            </w:pPr>
+            <w:r>
+              <w:t>{yes_mark}</w:t>
+            </w:r>
+          </w:p>
+        </w:tc>
+        <w:tc>
+          <w:tcPr>
+            <w:tcW w:w="1043" w:type="dxa"/>
+            <w:tcBorders>
+              <w:top w:val="single" w:color="auto" w:sz="6" w:space="0"/>
+              <w:left w:val="single" w:color="auto" w:sz="6" w:space="0"/>
+              <w:bottom w:val="single" w:color="auto" w:sz="6" w:space="0"/>
+              <w:right w:val="single" w:color="auto" w:sz="6" w:space="0"/>
+            </w:tcBorders>
+            <w:tcMar>
+              <w:left w:w="105" w:type="dxa"/>
+              <w:right w:w="105" w:type="dxa"/>
+            </w:tcMar>
+          </w:tcPr>
+          <w:p>
+            <w:pPr>
+              <w:jc w:val="center"/>
+            </w:pPr>
+            <w:r>
+              <w:t>{no_mark}</w:t>
+            </w:r>
+          </w:p>
+        </w:tc>
+        <w:tc>
+          <w:tcPr>
+            <w:tcW w:w="1108" w:type="dxa"/>
+            <w:tcBorders>
+              <w:top w:val="single" w:color="auto" w:sz="6" w:space="0"/>
+              <w:left w:val="single" w:color="auto" w:sz="6" w:space="0"/>
+              <w:bottom w:val="single" w:color="auto" w:sz="6" w:space="0"/>
+              <w:right w:val="single" w:color="auto" w:sz="6" w:space="0"/>
+            </w:tcBorders>
+            <w:tcMar>
+              <w:left w:w="105" w:type="dxa"/>
+              <w:right w:w="105" w:type="dxa"/>
+            </w:tcMar>
+          </w:tcPr>
+          <w:p>
+            <w:pPr>
+              <w:jc w:val="center"/>
+            </w:pPr>
+            <w:r>
+              <w:t>{na_mark}{/checklist}</w:t>
+            </w:r>
+          </w:p>
+        </w:tc>
+      </w:tr>
+    </w:tbl>
+    <w:p>
+      <w:r>
+        <w:t>{/modules}</w:t>
+      </w:r>
+    </w:p>
+    <w:p>
+      <w:pPr>
+        <w:pStyle w:val="Normal"/>
+        <w:rPr>
+          <w:rFonts w:ascii="Aptos" w:hAnsi="Aptos" w:eastAsia="Aptos" w:cs="Aptos"/>
+          <w:noProof w:val="0"/>
+          <w:sz w:val="24"/>
+          <w:szCs w:val="24"/>
+          <w:lang w:val="en-US"/>
+        </w:rPr>
+      </w:pPr>
+      <w:r>
+        <w:br/>
+      </w:r>
+      <w:r>
+        <w:rPr>
+          <w:sz w:val="22"/>
+          <w:szCs w:val="22"/>
+        </w:rPr>
+        <w:t xml:space="preserve">Please find </w:t>
+      </w:r>
+      <w:r>
+        <w:rPr>
+          <w:sz w:val="22"/>
+          <w:szCs w:val="22"/>
+        </w:rPr>
+        <w:t>th</w:t>
+      </w:r>
+      <w:r>
+        <w:rPr>
+          <w:sz w:val="22"/>
+          <w:szCs w:val="22"/>
+        </w:rPr>
+        <w:t>e</w:t>
+      </w:r>
+      <w:r>
+        <w:rPr>
+          <w:sz w:val="22"/>
+          <w:szCs w:val="22"/>
+        </w:rPr>
+        <w:t xml:space="preserve"> attached </w:t>
+      </w:r>
+      <w:r>
+        <w:rPr>
+          <w:sz w:val="22"/>
+          <w:szCs w:val="22"/>
+        </w:rPr>
+        <w:t>link for the changes made</w:t>
+      </w:r>
+      <w:r>
+        <w:rPr>
+          <w:sz w:val="22"/>
+          <w:szCs w:val="22"/>
+        </w:rPr>
+        <w:t>:</w:t>
+      </w:r>
+      <w:r>
+        <w:br/>
+      </w:r>
+      <w:hyperlink r:id="Rcbb83a288ae841ff">
+        <w:r>
+          <w:rPr>
+            <w:rStyle w:val="Hyperlink"/>
+            <w:noProof w:val="0"/>
+            <w:sz w:val="22"/>
+            <w:szCs w:val="22"/>
+            <w:lang w:val="en-US"/>
+          </w:rPr>
+          <w:t>{remediation_file_name}</w:t>
+        </w:r>
+      </w:hyperlink>
+    </w:p>
+    <w:p>
+      <w:pPr>
+        <w:rPr>
+          <w:rFonts w:ascii="Calibri" w:hAnsi="Calibri" w:eastAsia="Calibri" w:cs="Calibri"/>
+          <w:color w:val="000000" w:themeColor="text1"/>
+        </w:rPr>
+      </w:pPr>
+    </w:p>
+    <w:p/>
+    <w:p/>
+    <w:p/>
+    <w:sectPr>
+      <w:pgSz w:w="12240" w:h="15840" w:orient="portrait"/>
+      <w:pgMar w:top="1440" w:right="1440" w:bottom="1440" w:left="1440" w:header="720" w:footer="720" w:gutter="0"/>
+      <w:cols w:space="720"/>
+      <w:docGrid w:linePitch="360"/>
+    </w:sectPr>
+  </w:body>
+</w:document>
 </file>
 
 <file path=word/styles.xml><?xml version="1.0" encoding="utf-8"?>

</xml_diff>

<commit_message>
fix: remove blue module header row from dashboard template
</commit_message>
<xml_diff>
--- a/templates/TC_DASHBOARD_TEMPLATE_TAGGED.docx
+++ b/templates/TC_DASHBOARD_TEMPLATE_TAGGED.docx
@@ -228,36 +228,6 @@
         <w:gridCol w:w="1043"/>
         <w:gridCol w:w="1108"/>
       </w:tblGrid>
-      <w:tr>
-        <w:trPr>
-          <w:cantSplit/>
-        </w:trPr>
-        <w:tc>
-          <w:tcPr>
-            <w:tcW w:w="9072" w:type="dxa"/>
-            <w:gridSpan w:val="5"/>
-            <w:tcBorders>
-              <w:top w:val="single" w:sz="6"/>
-              <w:left w:val="single" w:sz="6"/>
-              <w:bottom w:val="single" w:sz="6"/>
-              <w:right w:val="single" w:sz="6"/>
-            </w:tcBorders>
-            <w:shd w:val="clear" w:color="auto" w:fill="D9E2F3"/>
-          </w:tcPr>
-          <w:p>
-            <w:pPr>
-              <w:spacing w:before="120" w:after="120"/>
-            </w:pPr>
-            <w:r>
-              <w:rPr>
-                <w:b w:val="1"/>
-                <w:sz w:val="24"/>
-              </w:rPr>
-              <w:t>{module_name}</w:t>
-            </w:r>
-          </w:p>
-        </w:tc>
-      </w:tr>
       <w:tr>
         <w:trPr>
           <w:trHeight w:val="300"/>

</xml_diff>